<commit_message>
Commit current project state
</commit_message>
<xml_diff>
--- a/capstone_written_responses.docx
+++ b/capstone_written_responses.docx
@@ -67,25 +67,7 @@
                 <w:sz w:val="26"/>
                 <w:szCs w:val="26"/>
               </w:rPr>
-              <w:t xml:space="preserve">Capstone Project —  </w:t>
-            </w:r>
-            <w:r>
-              <w:rPr>
-                <w:rFonts w:eastAsia="Arial" w:cs="Arial"/>
-                <w:color w:val="A5D8FF"/>
-                <w:sz w:val="26"/>
-                <w:szCs w:val="26"/>
-              </w:rPr>
-              <w:t xml:space="preserve">Skills for Hire Atlantic — </w:t>
-            </w:r>
-            <w:r>
-              <w:rPr>
-                <w:rFonts w:eastAsia="Arial" w:cs="Arial"/>
-                <w:color w:val="A5D8FF"/>
-                <w:sz w:val="26"/>
-                <w:szCs w:val="26"/>
-              </w:rPr>
-              <w:t>Written Responses</w:t>
+              <w:t>Capstone Project —  Skills for Hire Atlantic — Written Responses</w:t>
             </w:r>
           </w:p>
           <w:p>
@@ -134,7 +116,7 @@
       </w:pPr>
       <w:r>
         <w:rPr>
-          <w:rFonts w:eastAsia="Arial" w:cs="Arial" w:ascii="Arial" w:hAnsi="Arial"/>
+          <w:rFonts w:eastAsia="Arial" w:cs="Arial"/>
           <w:b/>
           <w:bCs/>
           <w:color w:val="1E3A5F"/>
@@ -184,15 +166,15 @@
         </w:tblCellMar>
       </w:tblPr>
       <w:tblGrid>
-        <w:gridCol w:w="2799"/>
-        <w:gridCol w:w="3761"/>
+        <w:gridCol w:w="2797"/>
+        <w:gridCol w:w="3763"/>
         <w:gridCol w:w="2800"/>
       </w:tblGrid>
       <w:tr>
         <w:trPr/>
         <w:tc>
           <w:tcPr>
-            <w:tcW w:w="2799" w:type="dxa"/>
+            <w:tcW w:w="2797" w:type="dxa"/>
             <w:tcBorders>
               <w:top w:val="single" w:sz="2" w:space="0" w:color="E5E7EB"/>
               <w:start w:val="single" w:sz="2" w:space="0" w:color="E5E7EB"/>
@@ -221,7 +203,7 @@
         </w:tc>
         <w:tc>
           <w:tcPr>
-            <w:tcW w:w="3761" w:type="dxa"/>
+            <w:tcW w:w="3763" w:type="dxa"/>
             <w:tcBorders>
               <w:top w:val="single" w:sz="2" w:space="0" w:color="E5E7EB"/>
               <w:start w:val="single" w:sz="2" w:space="0" w:color="E5E7EB"/>
@@ -282,7 +264,7 @@
         <w:trPr/>
         <w:tc>
           <w:tcPr>
-            <w:tcW w:w="2799" w:type="dxa"/>
+            <w:tcW w:w="2797" w:type="dxa"/>
             <w:tcBorders>
               <w:top w:val="single" w:sz="2" w:space="0" w:color="E5E7EB"/>
               <w:start w:val="single" w:sz="2" w:space="0" w:color="E5E7EB"/>
@@ -315,7 +297,7 @@
         </w:tc>
         <w:tc>
           <w:tcPr>
-            <w:tcW w:w="3761" w:type="dxa"/>
+            <w:tcW w:w="3763" w:type="dxa"/>
             <w:tcBorders>
               <w:top w:val="single" w:sz="2" w:space="0" w:color="E5E7EB"/>
               <w:start w:val="single" w:sz="2" w:space="0" w:color="E5E7EB"/>
@@ -380,7 +362,7 @@
         <w:trPr/>
         <w:tc>
           <w:tcPr>
-            <w:tcW w:w="2799" w:type="dxa"/>
+            <w:tcW w:w="2797" w:type="dxa"/>
             <w:tcBorders>
               <w:top w:val="single" w:sz="2" w:space="0" w:color="E5E7EB"/>
               <w:start w:val="single" w:sz="2" w:space="0" w:color="E5E7EB"/>
@@ -413,7 +395,7 @@
         </w:tc>
         <w:tc>
           <w:tcPr>
-            <w:tcW w:w="3761" w:type="dxa"/>
+            <w:tcW w:w="3763" w:type="dxa"/>
             <w:tcBorders>
               <w:top w:val="single" w:sz="2" w:space="0" w:color="E5E7EB"/>
               <w:start w:val="single" w:sz="2" w:space="0" w:color="E5E7EB"/>
@@ -478,7 +460,7 @@
         <w:trPr/>
         <w:tc>
           <w:tcPr>
-            <w:tcW w:w="2799" w:type="dxa"/>
+            <w:tcW w:w="2797" w:type="dxa"/>
             <w:tcBorders>
               <w:top w:val="single" w:sz="2" w:space="0" w:color="E5E7EB"/>
               <w:start w:val="single" w:sz="2" w:space="0" w:color="E5E7EB"/>
@@ -511,7 +493,7 @@
         </w:tc>
         <w:tc>
           <w:tcPr>
-            <w:tcW w:w="3761" w:type="dxa"/>
+            <w:tcW w:w="3763" w:type="dxa"/>
             <w:tcBorders>
               <w:top w:val="single" w:sz="2" w:space="0" w:color="E5E7EB"/>
               <w:start w:val="single" w:sz="2" w:space="0" w:color="E5E7EB"/>
@@ -675,7 +657,7 @@
       </w:pPr>
       <w:r>
         <w:rPr>
-          <w:rFonts w:eastAsia="Arial" w:cs="Arial" w:ascii="Arial" w:hAnsi="Arial"/>
+          <w:rFonts w:eastAsia="Arial" w:cs="Arial"/>
           <w:b/>
           <w:bCs/>
           <w:color w:val="2563EB"/>
@@ -698,228 +680,39 @@
           <w:sz w:val="22"/>
           <w:szCs w:val="22"/>
         </w:rPr>
-        <w:t>I</w:t>
-      </w:r>
-      <w:r>
-        <w:rPr>
-          <w:rFonts w:eastAsia="Arial" w:cs="Arial"/>
-          <w:color w:val="374151"/>
-          <w:sz w:val="22"/>
-          <w:szCs w:val="22"/>
-        </w:rPr>
-        <w:t xml:space="preserve"> train across multiple disciplines </w:t>
-      </w:r>
-      <w:r>
-        <w:rPr>
-          <w:rFonts w:eastAsia="Arial" w:cs="Arial"/>
-          <w:color w:val="374151"/>
-          <w:sz w:val="22"/>
-          <w:szCs w:val="22"/>
-        </w:rPr>
-        <w:t>(</w:t>
-      </w:r>
-      <w:r>
-        <w:rPr>
-          <w:rFonts w:eastAsia="Arial" w:cs="Arial"/>
-          <w:color w:val="374151"/>
-          <w:sz w:val="22"/>
-          <w:szCs w:val="22"/>
-        </w:rPr>
-        <w:t>CrossFit and Powerlifting</w:t>
-      </w:r>
-      <w:r>
-        <w:rPr>
-          <w:rFonts w:eastAsia="Arial" w:cs="Arial"/>
-          <w:color w:val="374151"/>
-          <w:sz w:val="22"/>
-          <w:szCs w:val="22"/>
-        </w:rPr>
-        <w:t xml:space="preserve">) and </w:t>
-      </w:r>
-      <w:r>
-        <w:rPr>
-          <w:rFonts w:eastAsia="Arial" w:cs="Arial"/>
-          <w:color w:val="374151"/>
-          <w:sz w:val="22"/>
-          <w:szCs w:val="22"/>
-        </w:rPr>
-        <w:t xml:space="preserve">generate a significant volume of performance data through the apps </w:t>
-      </w:r>
-      <w:r>
-        <w:rPr>
-          <w:rFonts w:eastAsia="Arial" w:cs="Arial"/>
-          <w:color w:val="374151"/>
-          <w:sz w:val="22"/>
-          <w:szCs w:val="22"/>
-        </w:rPr>
-        <w:t>I</w:t>
-      </w:r>
-      <w:r>
-        <w:rPr>
-          <w:rFonts w:eastAsia="Arial" w:cs="Arial"/>
-          <w:color w:val="374151"/>
-          <w:sz w:val="22"/>
-          <w:szCs w:val="22"/>
-        </w:rPr>
-        <w:t xml:space="preserve"> already use. SugarWOD logs every workout score, load, and personal note. Garmin captures heart rate, HRV, and sleep quality. </w:t>
-      </w:r>
-      <w:r>
-        <w:rPr>
-          <w:rFonts w:eastAsia="Arial" w:cs="Arial"/>
-          <w:color w:val="374151"/>
-          <w:sz w:val="22"/>
-          <w:szCs w:val="22"/>
-        </w:rPr>
-        <w:t>The</w:t>
-      </w:r>
-      <w:r>
-        <w:rPr>
-          <w:rFonts w:eastAsia="Arial" w:cs="Arial"/>
-          <w:color w:val="374151"/>
-          <w:sz w:val="22"/>
-          <w:szCs w:val="22"/>
-        </w:rPr>
-        <w:t xml:space="preserve"> powerlifting coach provides a periodised training plan in PDF form.</w:t>
-      </w:r>
-    </w:p>
-    <w:p>
-      <w:pPr>
-        <w:pStyle w:val="Normal"/>
-        <w:spacing w:before="60" w:after="120"/>
-        <w:rPr/>
-      </w:pPr>
-      <w:r>
-        <w:rPr>
-          <w:rFonts w:eastAsia="Arial" w:cs="Arial"/>
-          <w:color w:val="374151"/>
-          <w:sz w:val="22"/>
-          <w:szCs w:val="22"/>
-        </w:rPr>
-        <w:t xml:space="preserve">The problem is that none of this data talks to each other. Each app shows </w:t>
-      </w:r>
-      <w:r>
-        <w:rPr>
-          <w:rFonts w:eastAsia="Arial" w:cs="Arial"/>
-          <w:color w:val="374151"/>
-          <w:sz w:val="22"/>
-          <w:szCs w:val="22"/>
-        </w:rPr>
-        <w:t>me</w:t>
-      </w:r>
-      <w:r>
-        <w:rPr>
-          <w:rFonts w:eastAsia="Arial" w:cs="Arial"/>
-          <w:color w:val="374151"/>
-          <w:sz w:val="22"/>
-          <w:szCs w:val="22"/>
-        </w:rPr>
-        <w:t xml:space="preserve"> only its own slice. A CrossFit app tells </w:t>
-      </w:r>
-      <w:r>
-        <w:rPr>
-          <w:rFonts w:eastAsia="Arial" w:cs="Arial"/>
-          <w:color w:val="374151"/>
-          <w:sz w:val="22"/>
-          <w:szCs w:val="22"/>
-        </w:rPr>
-        <w:t>me my</w:t>
-      </w:r>
-      <w:r>
-        <w:rPr>
-          <w:rFonts w:eastAsia="Arial" w:cs="Arial"/>
-          <w:color w:val="374151"/>
-          <w:sz w:val="22"/>
-          <w:szCs w:val="22"/>
-        </w:rPr>
-        <w:t xml:space="preserve"> Fran time but nothing about whether </w:t>
-      </w:r>
-      <w:r>
-        <w:rPr>
-          <w:rFonts w:eastAsia="Arial" w:cs="Arial"/>
-          <w:color w:val="374151"/>
-          <w:sz w:val="22"/>
-          <w:szCs w:val="22"/>
-        </w:rPr>
-        <w:t>my</w:t>
-      </w:r>
-      <w:r>
-        <w:rPr>
-          <w:rFonts w:eastAsia="Arial" w:cs="Arial"/>
-          <w:color w:val="374151"/>
-          <w:sz w:val="22"/>
-          <w:szCs w:val="22"/>
-        </w:rPr>
-        <w:t xml:space="preserve"> sleep last night or </w:t>
-      </w:r>
-      <w:r>
-        <w:rPr>
-          <w:rFonts w:eastAsia="Arial" w:cs="Arial"/>
-          <w:color w:val="374151"/>
-          <w:sz w:val="22"/>
-          <w:szCs w:val="22"/>
-        </w:rPr>
-        <w:t>my</w:t>
-      </w:r>
-      <w:r>
-        <w:rPr>
-          <w:rFonts w:eastAsia="Arial" w:cs="Arial"/>
-          <w:color w:val="374151"/>
-          <w:sz w:val="22"/>
-          <w:szCs w:val="22"/>
-        </w:rPr>
-        <w:t xml:space="preserve"> squat volume three days ago explains why it was off. </w:t>
-      </w:r>
-      <w:r>
-        <w:rPr>
-          <w:rFonts w:eastAsia="Arial" w:cs="Arial"/>
-          <w:color w:val="374151"/>
-          <w:sz w:val="22"/>
-          <w:szCs w:val="22"/>
-        </w:rPr>
-        <w:t>I am</w:t>
-      </w:r>
-      <w:r>
-        <w:rPr>
-          <w:rFonts w:eastAsia="Arial" w:cs="Arial"/>
-          <w:color w:val="374151"/>
-          <w:sz w:val="22"/>
-          <w:szCs w:val="22"/>
-        </w:rPr>
-        <w:t xml:space="preserve"> left to mentally stitch together signals from three separate sources, which rarely happens in practice, </w:t>
-      </w:r>
-      <w:r>
-        <w:rPr>
-          <w:rFonts w:eastAsia="Arial" w:cs="Arial"/>
-          <w:color w:val="374151"/>
-          <w:sz w:val="22"/>
-          <w:szCs w:val="22"/>
-        </w:rPr>
-        <w:t>as evidenced by my worse performance while trying to re-do 26.1.</w:t>
-      </w:r>
-    </w:p>
-    <w:p>
-      <w:pPr>
-        <w:pStyle w:val="Normal"/>
-        <w:spacing w:before="60" w:after="120"/>
-        <w:rPr/>
-      </w:pPr>
-      <w:r>
-        <w:rPr>
-          <w:rFonts w:eastAsia="Arial" w:cs="Arial"/>
-          <w:color w:val="374151"/>
-          <w:sz w:val="22"/>
-          <w:szCs w:val="22"/>
-        </w:rPr>
-        <w:t xml:space="preserve">The result: decisions about training — when to push hard, when to rest, when to expect a PR — are made on instinct rather than evidence. </w:t>
-      </w:r>
-      <w:r>
-        <w:rPr>
-          <w:rFonts w:eastAsia="Arial" w:cs="Arial"/>
-          <w:color w:val="374151"/>
-          <w:sz w:val="22"/>
-          <w:szCs w:val="22"/>
-        </w:rPr>
-        <w:t>But we can do better!</w:t>
+        <w:t>I train across multiple disciplines (CrossFit and Powerlifting) and generate a significant volume of performance data through the apps I already use. SugarWOD logs every workout score, load, and personal note. Garmin captures heart rate, HRV, and sleep quality. The powerlifting coach provides a periodised training plan in PDF form.</w:t>
+      </w:r>
+    </w:p>
+    <w:p>
+      <w:pPr>
+        <w:pStyle w:val="Normal"/>
+        <w:spacing w:before="60" w:after="120"/>
+        <w:rPr/>
+      </w:pPr>
+      <w:r>
+        <w:rPr>
+          <w:rFonts w:eastAsia="Arial" w:cs="Arial"/>
+          <w:color w:val="374151"/>
+          <w:sz w:val="22"/>
+          <w:szCs w:val="22"/>
+        </w:rPr>
+        <w:t>The problem is that none of this data talks to each other. Each app shows me only its own slice. A CrossFit app tells me my Fran time but nothing about whether my sleep last night or my squat volume three days ago explains why it was off. I am left to mentally stitch together signals from three separate sources, which rarely happens in practice, as evidenced by my worse performance while trying to re-do 26.1.</w:t>
+      </w:r>
+    </w:p>
+    <w:p>
+      <w:pPr>
+        <w:pStyle w:val="Normal"/>
+        <w:spacing w:before="60" w:after="120"/>
+        <w:rPr/>
+      </w:pPr>
+      <w:r>
+        <w:rPr>
+          <w:rFonts w:eastAsia="Arial" w:cs="Arial"/>
+          <w:color w:val="374151"/>
+          <w:sz w:val="22"/>
+          <w:szCs w:val="22"/>
+        </w:rPr>
+        <w:t>The result: decisions about training (e.g., when to push hard, when to rest, when to expect a PR) are made on instinct rather than evidence. But we can do better!</w:t>
       </w:r>
     </w:p>
     <w:p>
@@ -939,7 +732,7 @@
       </w:pPr>
       <w:r>
         <w:rPr>
-          <w:rFonts w:eastAsia="Arial" w:cs="Arial" w:ascii="Arial" w:hAnsi="Arial"/>
+          <w:rFonts w:eastAsia="Arial" w:cs="Arial"/>
           <w:b/>
           <w:bCs/>
           <w:color w:val="2563EB"/>
@@ -962,86 +755,23 @@
           <w:sz w:val="22"/>
           <w:szCs w:val="22"/>
         </w:rPr>
-        <w:t xml:space="preserve">Performance data collected over months and years contains patterns that are invisible without analysis. </w:t>
-      </w:r>
-      <w:r>
-        <w:rPr>
-          <w:rFonts w:eastAsia="Arial" w:cs="Arial"/>
-          <w:color w:val="374151"/>
-          <w:sz w:val="22"/>
-          <w:szCs w:val="22"/>
-        </w:rPr>
-        <w:t xml:space="preserve">My </w:t>
-      </w:r>
-      <w:r>
-        <w:rPr>
-          <w:rFonts w:eastAsia="Arial" w:cs="Arial"/>
-          <w:color w:val="374151"/>
-          <w:sz w:val="22"/>
-          <w:szCs w:val="22"/>
-        </w:rPr>
-        <w:t xml:space="preserve">workout notes, written in natural language, reveal a consistently positive sentiment (average +0.55) that does not strongly correlate with RX performance — a non-obvious finding that raises questions worth exploring. </w:t>
-      </w:r>
-      <w:r>
-        <w:rPr>
-          <w:rFonts w:eastAsia="Arial" w:cs="Arial"/>
-          <w:color w:val="374151"/>
-          <w:sz w:val="22"/>
-          <w:szCs w:val="22"/>
-        </w:rPr>
-        <w:t>My</w:t>
-      </w:r>
-      <w:r>
-        <w:rPr>
-          <w:rFonts w:eastAsia="Arial" w:cs="Arial"/>
-          <w:color w:val="374151"/>
-          <w:sz w:val="22"/>
-          <w:szCs w:val="22"/>
-        </w:rPr>
-        <w:t xml:space="preserve"> Power Snatch progression curve, fitted with a linear regression model, predicts a PR attempt window approximately 10 days out from the last session </w:t>
-      </w:r>
-      <w:r>
-        <w:rPr>
-          <w:rFonts w:eastAsia="Arial" w:cs="Arial"/>
-          <w:color w:val="374151"/>
-          <w:sz w:val="22"/>
-          <w:szCs w:val="22"/>
-        </w:rPr>
-        <w:t>(which is a fun result, but also requires further investigation)</w:t>
-      </w:r>
-      <w:r>
-        <w:rPr>
-          <w:rFonts w:eastAsia="Arial" w:cs="Arial"/>
-          <w:color w:val="374151"/>
-          <w:sz w:val="22"/>
-          <w:szCs w:val="22"/>
-        </w:rPr>
-        <w:t>.</w:t>
-      </w:r>
-    </w:p>
-    <w:p>
-      <w:pPr>
-        <w:pStyle w:val="Normal"/>
-        <w:spacing w:before="60" w:after="120"/>
-        <w:rPr/>
-      </w:pPr>
-      <w:r>
-        <w:rPr>
-          <w:rFonts w:eastAsia="Arial" w:cs="Arial"/>
-          <w:color w:val="374151"/>
-          <w:sz w:val="22"/>
-          <w:szCs w:val="22"/>
-        </w:rPr>
-        <w:t xml:space="preserve">None of these findings require sophisticated AI. They require the data to be cleaned, combined, and analysed: something the existing apps do not do. The Generative AI layer then adds a layer that no static dashboard can provide: the ability to ask questions in plain language and receive contextualised, reasoned answers drawn from the actual data. </w:t>
-      </w:r>
-      <w:r>
-        <w:rPr>
-          <w:rFonts w:eastAsia="Arial" w:cs="Arial"/>
-          <w:color w:val="374151"/>
-          <w:sz w:val="22"/>
-          <w:szCs w:val="22"/>
-        </w:rPr>
-        <w:t>I am looking forward to it.</w:t>
+        <w:t>Performance data collected over months and years contains patterns that are invisible without analysis. My workout notes, written in natural language, reveal a consistently positive sentiment (average +0.55) that does not strongly correlate with RX performance, this is a non-obvious finding that raises questions worth exploring. My Power Snatch progression curve, fitted with a linear regression model, predicts a PR attempt window approximately 10 days out from the last session (which is a fun result, but also requires further investigation).</w:t>
+      </w:r>
+    </w:p>
+    <w:p>
+      <w:pPr>
+        <w:pStyle w:val="Normal"/>
+        <w:spacing w:before="60" w:after="120"/>
+        <w:rPr/>
+      </w:pPr>
+      <w:r>
+        <w:rPr>
+          <w:rFonts w:eastAsia="Arial" w:cs="Arial"/>
+          <w:color w:val="374151"/>
+          <w:sz w:val="22"/>
+          <w:szCs w:val="22"/>
+        </w:rPr>
+        <w:t>None of these findings require sophisticated AI. They require the data to be cleaned, combined, and analysed: something the existing apps do not do. The Generative AI layer then adds a layer that no static dashboard can provide: the ability to ask questions in plain language and receive contextualised, reasoned answers drawn from the actual data. I am looking forward to it.</w:t>
       </w:r>
     </w:p>
     <w:p>
@@ -1061,7 +791,7 @@
       </w:pPr>
       <w:r>
         <w:rPr>
-          <w:rFonts w:eastAsia="Arial" w:cs="Arial" w:ascii="Arial" w:hAnsi="Arial"/>
+          <w:rFonts w:eastAsia="Arial" w:cs="Arial"/>
           <w:b/>
           <w:bCs/>
           <w:color w:val="2563EB"/>
@@ -1084,70 +814,7 @@
           <w:sz w:val="22"/>
           <w:szCs w:val="22"/>
         </w:rPr>
-        <w:t xml:space="preserve">The immediate beneficiary is… </w:t>
-      </w:r>
-      <w:r>
-        <w:rPr>
-          <w:rFonts w:eastAsia="Arial" w:cs="Arial"/>
-          <w:color w:val="374151"/>
-          <w:sz w:val="22"/>
-          <w:szCs w:val="22"/>
-        </w:rPr>
-        <w:t>myself!</w:t>
-      </w:r>
-      <w:r>
-        <w:rPr>
-          <w:rFonts w:eastAsia="Arial" w:cs="Arial"/>
-          <w:color w:val="374151"/>
-          <w:sz w:val="22"/>
-          <w:szCs w:val="22"/>
-        </w:rPr>
-        <w:t xml:space="preserve"> A useful outcome is a system </w:t>
-      </w:r>
-      <w:r>
-        <w:rPr>
-          <w:rFonts w:eastAsia="Arial" w:cs="Arial"/>
-          <w:color w:val="374151"/>
-          <w:sz w:val="22"/>
-          <w:szCs w:val="22"/>
-        </w:rPr>
-        <w:t>I</w:t>
-      </w:r>
-      <w:r>
-        <w:rPr>
-          <w:rFonts w:eastAsia="Arial" w:cs="Arial"/>
-          <w:color w:val="374151"/>
-          <w:sz w:val="22"/>
-          <w:szCs w:val="22"/>
-        </w:rPr>
-        <w:t xml:space="preserve"> can open on any given day, ask "should I go heavy today?" or "how has my consistency been this month?", and receive a specific, data-backed answer — not a generic recommendation from an algorithm that knows nothing about </w:t>
-      </w:r>
-      <w:r>
-        <w:rPr>
-          <w:rFonts w:eastAsia="Arial" w:cs="Arial"/>
-          <w:color w:val="374151"/>
-          <w:sz w:val="22"/>
-          <w:szCs w:val="22"/>
-        </w:rPr>
-        <w:t>my</w:t>
-      </w:r>
-      <w:r>
-        <w:rPr>
-          <w:rFonts w:eastAsia="Arial" w:cs="Arial"/>
-          <w:color w:val="374151"/>
-          <w:sz w:val="22"/>
-          <w:szCs w:val="22"/>
-        </w:rPr>
-        <w:t xml:space="preserve"> history. </w:t>
-      </w:r>
-      <w:r>
-        <w:rPr>
-          <w:rFonts w:eastAsia="Arial" w:cs="Arial"/>
-          <w:color w:val="374151"/>
-          <w:sz w:val="22"/>
-          <w:szCs w:val="22"/>
-        </w:rPr>
-        <w:t>This will help me to keep motivated, track progress in a more meaningful way and train smarter.</w:t>
+        <w:t>The immediate beneficiary is… myself! A useful outcome is a system I can open on any given day, ask "should I go heavy today?" or "how has my consistency been this month?", and receive a specific, data-backed answer — not a generic recommendation from an algorithm that knows nothing about my history. This will help me to keep motivated, track progress in a more meaningful way and train smarter.</w:t>
       </w:r>
     </w:p>
     <w:p>
@@ -1268,7 +935,7 @@
       </w:pPr>
       <w:r>
         <w:rPr>
-          <w:rFonts w:eastAsia="Arial" w:cs="Arial" w:ascii="Arial" w:hAnsi="Arial"/>
+          <w:rFonts w:eastAsia="Arial" w:cs="Arial"/>
           <w:b/>
           <w:bCs/>
           <w:color w:val="2563EB"/>
@@ -1291,25 +958,7 @@
           <w:sz w:val="22"/>
           <w:szCs w:val="22"/>
         </w:rPr>
-        <w:t xml:space="preserve">The project was structured in three layers that correspond directly to the three required components: data processing first, then machine learning on top of clean data, then Generative AI as an orchestration and reasoning layer. This sequencing was deliberate </w:t>
-      </w:r>
-      <w:r>
-        <w:rPr>
-          <w:rFonts w:eastAsia="Arial" w:cs="Arial"/>
-          <w:color w:val="374151"/>
-          <w:sz w:val="22"/>
-          <w:szCs w:val="22"/>
-        </w:rPr>
-        <w:t>since</w:t>
-      </w:r>
-      <w:r>
-        <w:rPr>
-          <w:rFonts w:eastAsia="Arial" w:cs="Arial"/>
-          <w:color w:val="374151"/>
-          <w:sz w:val="22"/>
-          <w:szCs w:val="22"/>
-        </w:rPr>
-        <w:t xml:space="preserve"> each layer depends on the one below it. The ML models are only meaningful because the data is properly cleaned and normalised. The AI agent is only useful because the ML outputs give it real numbers to reason over.</w:t>
+        <w:t>The project was structured in three layers that correspond directly to the three required components: data processing first, then machine learning on top of clean data, then Generative AI as an orchestration and reasoning layer. This sequencing was deliberate since each layer depends on the one below it. The ML models are only meaningful because the data is properly cleaned and normalised. The AI agent is only useful because the ML outputs give it real numbers to reason over.</w:t>
       </w:r>
     </w:p>
     <w:p>
@@ -1329,7 +978,7 @@
       </w:pPr>
       <w:r>
         <w:rPr>
-          <w:rFonts w:eastAsia="Arial" w:cs="Arial" w:ascii="Arial" w:hAnsi="Arial"/>
+          <w:rFonts w:eastAsia="Arial" w:cs="Arial"/>
           <w:b/>
           <w:bCs/>
           <w:color w:val="2563EB"/>
@@ -1368,43 +1017,7 @@
           <w:sz w:val="22"/>
           <w:szCs w:val="22"/>
         </w:rPr>
-        <w:t xml:space="preserve">Pandas was the obvious choice — it handles mixed-type columns, date parsing edge cases (the file uses MM/DD/YYYY), and groupby aggregations </w:t>
-      </w:r>
-      <w:r>
-        <w:rPr>
-          <w:rFonts w:eastAsia="Arial" w:cs="Arial"/>
-          <w:color w:val="374151"/>
-          <w:sz w:val="22"/>
-          <w:szCs w:val="22"/>
-        </w:rPr>
-        <w:t>(</w:t>
-      </w:r>
-      <w:r>
-        <w:rPr>
-          <w:rFonts w:eastAsia="Arial" w:cs="Arial"/>
-          <w:color w:val="374151"/>
-          <w:sz w:val="22"/>
-          <w:szCs w:val="22"/>
-        </w:rPr>
-        <w:t>efficiently at this data size</w:t>
-      </w:r>
-      <w:r>
-        <w:rPr>
-          <w:rFonts w:eastAsia="Arial" w:cs="Arial"/>
-          <w:color w:val="374151"/>
-          <w:sz w:val="22"/>
-          <w:szCs w:val="22"/>
-        </w:rPr>
-        <w:t>)</w:t>
-      </w:r>
-      <w:r>
-        <w:rPr>
-          <w:rFonts w:eastAsia="Arial" w:cs="Arial"/>
-          <w:color w:val="374151"/>
-          <w:sz w:val="22"/>
-          <w:szCs w:val="22"/>
-        </w:rPr>
-        <w:t>. Matplotlib and Seaborn were selected for visualisation because they integrate directly with the Streamlit frontend without additional conversion steps. Ten distinct charts were produced covering attendance patterns, sentiment trends, strength progression per lift, lift correlation, scaling ratio, PR timeline, and ML outputs.</w:t>
+        <w:t>Pandas was the obvious choice — it handles mixed-type columns, date parsing edge cases (the file uses MM/DD/YYYY), and groupby aggregations (efficiently at this data size). Matplotlib and Seaborn were selected for visualisation because they integrate directly with the Streamlit frontend without additional conversion steps. Ten distinct charts were produced covering attendance patterns, sentiment trends, strength progression per lift, lift correlation, scaling ratio, PR timeline, and ML outputs.</w:t>
       </w:r>
     </w:p>
     <w:p>
@@ -1424,7 +1037,7 @@
       </w:pPr>
       <w:r>
         <w:rPr>
-          <w:rFonts w:eastAsia="Arial" w:cs="Arial" w:ascii="Arial" w:hAnsi="Arial"/>
+          <w:rFonts w:eastAsia="Arial" w:cs="Arial"/>
           <w:b/>
           <w:bCs/>
           <w:color w:val="2563EB"/>
@@ -1474,14 +1087,14 @@
         </w:tblCellMar>
       </w:tblPr>
       <w:tblGrid>
-        <w:gridCol w:w="2399"/>
-        <w:gridCol w:w="6961"/>
+        <w:gridCol w:w="2398"/>
+        <w:gridCol w:w="6962"/>
       </w:tblGrid>
       <w:tr>
         <w:trPr/>
         <w:tc>
           <w:tcPr>
-            <w:tcW w:w="2399" w:type="dxa"/>
+            <w:tcW w:w="2398" w:type="dxa"/>
             <w:tcBorders>
               <w:top w:val="single" w:sz="2" w:space="0" w:color="E5E7EB"/>
               <w:start w:val="single" w:sz="2" w:space="0" w:color="E5E7EB"/>
@@ -1510,7 +1123,7 @@
         </w:tc>
         <w:tc>
           <w:tcPr>
-            <w:tcW w:w="6961" w:type="dxa"/>
+            <w:tcW w:w="6962" w:type="dxa"/>
             <w:tcBorders>
               <w:top w:val="single" w:sz="2" w:space="0" w:color="E5E7EB"/>
               <w:start w:val="single" w:sz="2" w:space="0" w:color="E5E7EB"/>
@@ -1531,43 +1144,7 @@
                 <w:sz w:val="22"/>
                 <w:szCs w:val="22"/>
               </w:rPr>
-              <w:t xml:space="preserve">The workout dataset contains no pre-defined workout type labels beyond the raw title strings. KMeans was selected to discover natural groupings without supervision. k=4 was chosen via the elbow method. The resulting clusters </w:t>
-            </w:r>
-            <w:r>
-              <w:rPr>
-                <w:rFonts w:eastAsia="Arial" w:cs="Arial"/>
-                <w:color w:val="6B7280"/>
-                <w:sz w:val="22"/>
-                <w:szCs w:val="22"/>
-              </w:rPr>
-              <w:t>(</w:t>
-            </w:r>
-            <w:r>
-              <w:rPr>
-                <w:rFonts w:eastAsia="Arial" w:cs="Arial"/>
-                <w:color w:val="6B7280"/>
-                <w:sz w:val="22"/>
-                <w:szCs w:val="22"/>
-              </w:rPr>
-              <w:t>Strength/Lifting, Timed Metcon, AMRAP, Accessory</w:t>
-            </w:r>
-            <w:r>
-              <w:rPr>
-                <w:rFonts w:eastAsia="Arial" w:cs="Arial"/>
-                <w:color w:val="6B7280"/>
-                <w:sz w:val="22"/>
-                <w:szCs w:val="22"/>
-              </w:rPr>
-              <w:t>)</w:t>
-            </w:r>
-            <w:r>
-              <w:rPr>
-                <w:rFonts w:eastAsia="Arial" w:cs="Arial"/>
-                <w:color w:val="6B7280"/>
-                <w:sz w:val="22"/>
-                <w:szCs w:val="22"/>
-              </w:rPr>
-              <w:t xml:space="preserve"> map well to actual CrossFit programming logic, validating the approach.</w:t>
+              <w:t>The workout dataset contains no pre-defined workout type labels beyond the raw title strings. KMeans was selected to discover natural groupings without supervision. k=4 was chosen via the elbow method. The resulting clusters (Strength/Lifting, Timed Metcon, AMRAP, Accessory) map well to actual CrossFit programming logic, validating the approach.</w:t>
             </w:r>
           </w:p>
         </w:tc>
@@ -1576,7 +1153,7 @@
         <w:trPr/>
         <w:tc>
           <w:tcPr>
-            <w:tcW w:w="2399" w:type="dxa"/>
+            <w:tcW w:w="2398" w:type="dxa"/>
             <w:tcBorders>
               <w:top w:val="single" w:sz="2" w:space="0" w:color="E5E7EB"/>
               <w:start w:val="single" w:sz="2" w:space="0" w:color="E5E7EB"/>
@@ -1605,7 +1182,7 @@
         </w:tc>
         <w:tc>
           <w:tcPr>
-            <w:tcW w:w="6961" w:type="dxa"/>
+            <w:tcW w:w="6962" w:type="dxa"/>
             <w:tcBorders>
               <w:top w:val="single" w:sz="2" w:space="0" w:color="E5E7EB"/>
               <w:start w:val="single" w:sz="2" w:space="0" w:color="E5E7EB"/>
@@ -1635,7 +1212,7 @@
         <w:trPr/>
         <w:tc>
           <w:tcPr>
-            <w:tcW w:w="2399" w:type="dxa"/>
+            <w:tcW w:w="2398" w:type="dxa"/>
             <w:tcBorders>
               <w:top w:val="single" w:sz="2" w:space="0" w:color="E5E7EB"/>
               <w:start w:val="single" w:sz="2" w:space="0" w:color="E5E7EB"/>
@@ -1664,7 +1241,7 @@
         </w:tc>
         <w:tc>
           <w:tcPr>
-            <w:tcW w:w="6961" w:type="dxa"/>
+            <w:tcW w:w="6962" w:type="dxa"/>
             <w:tcBorders>
               <w:top w:val="single" w:sz="2" w:space="0" w:color="E5E7EB"/>
               <w:start w:val="single" w:sz="2" w:space="0" w:color="E5E7EB"/>
@@ -1708,7 +1285,7 @@
       </w:pPr>
       <w:r>
         <w:rPr>
-          <w:rFonts w:eastAsia="Arial" w:cs="Arial" w:ascii="Arial" w:hAnsi="Arial"/>
+          <w:rFonts w:eastAsia="Arial" w:cs="Arial"/>
           <w:b/>
           <w:bCs/>
           <w:color w:val="2563EB"/>
@@ -1731,39 +1308,39 @@
           <w:sz w:val="22"/>
           <w:szCs w:val="22"/>
         </w:rPr>
-        <w:t>Claude (claude-sonnet via Anthropic API) was integrated as an agentic reasoning layer using the tool-use pattern. The agent is given a set of tools — each wrapping one analysis function — and a system prompt describing the athlete's context and data. When the user asks a question, Claude decides which tools to call, interprets the JSON results, and synthesises a natural language response.</w:t>
-      </w:r>
-    </w:p>
-    <w:p>
-      <w:pPr>
-        <w:pStyle w:val="Normal"/>
-        <w:spacing w:before="60" w:after="120"/>
-        <w:rPr/>
-      </w:pPr>
-      <w:r>
-        <w:rPr>
-          <w:rFonts w:eastAsia="Arial" w:cs="Arial"/>
-          <w:color w:val="374151"/>
-          <w:sz w:val="22"/>
-          <w:szCs w:val="22"/>
-        </w:rPr>
-        <w:t>This approach was chosen over simpler alternatives (such as feeding all data into a single prompt) for two reasons. First, tool-use allows the agent to be selective — it calls only the tools relevant to the question, which keeps latency low and responses focused. Second, the JSON summaries returned by each tool are compact and structured, which makes it easy for the model to reason accurately without hallucinating figures.</w:t>
-      </w:r>
-    </w:p>
-    <w:p>
-      <w:pPr>
-        <w:pStyle w:val="Normal"/>
-        <w:spacing w:before="60" w:after="120"/>
-        <w:rPr/>
-      </w:pPr>
-      <w:r>
-        <w:rPr>
-          <w:rFonts w:eastAsia="Arial" w:cs="Arial"/>
-          <w:color w:val="374151"/>
-          <w:sz w:val="22"/>
-          <w:szCs w:val="22"/>
-        </w:rPr>
-        <w:t>The interface was built in Streamlit because it requires no frontend development knowledge while producing a usable chat UI with sidebar chart controls — appropriate for a single-user local application at this stage of the project.</w:t>
+        <w:t>Claude (claude-sonnet via Anthropic API) was integrated as an agentic reasoning layer using the tool-use pattern. The agent is given a set of tools (each wrapping one analysis function) and a system prompt describing my context and data. When I ask a question, Claude decides which tools to call, interprets the JSON results, and synthesises a natural language response.</w:t>
+      </w:r>
+    </w:p>
+    <w:p>
+      <w:pPr>
+        <w:pStyle w:val="Normal"/>
+        <w:spacing w:before="60" w:after="120"/>
+        <w:rPr/>
+      </w:pPr>
+      <w:r>
+        <w:rPr>
+          <w:rFonts w:eastAsia="Arial" w:cs="Arial"/>
+          <w:color w:val="374151"/>
+          <w:sz w:val="22"/>
+          <w:szCs w:val="22"/>
+        </w:rPr>
+        <w:t>This approach was chosen over simpler alternatives (such as feeding all data into a single prompt) for two reasons. First, tool-use allows the agent to be selective: it calls only the tools relevant to the question, which keeps latency low and responses focused. Second, the JSON summaries returned by each tool are compact and structured, which makes it easy for the model to reason accurately without hallucinating figures.</w:t>
+      </w:r>
+    </w:p>
+    <w:p>
+      <w:pPr>
+        <w:pStyle w:val="Normal"/>
+        <w:spacing w:before="60" w:after="120"/>
+        <w:rPr/>
+      </w:pPr>
+      <w:r>
+        <w:rPr>
+          <w:rFonts w:eastAsia="Arial" w:cs="Arial"/>
+          <w:color w:val="374151"/>
+          <w:sz w:val="22"/>
+          <w:szCs w:val="22"/>
+        </w:rPr>
+        <w:t>The interface was built in Streamlit because it requires no frontend development knowledge while producing a usable chat UI with sidebar chart controls which is appropriate for a single-user local application at this stage of the project.</w:t>
       </w:r>
     </w:p>
     <w:p>
@@ -1783,7 +1360,7 @@
       </w:pPr>
       <w:r>
         <w:rPr>
-          <w:rFonts w:eastAsia="Arial" w:cs="Arial" w:ascii="Arial" w:hAnsi="Arial"/>
+          <w:rFonts w:eastAsia="Arial" w:cs="Arial"/>
           <w:b/>
           <w:bCs/>
           <w:color w:val="2563EB"/>
@@ -1911,7 +1488,7 @@
       </w:pPr>
       <w:r>
         <w:rPr>
-          <w:rFonts w:eastAsia="Arial" w:cs="Arial" w:ascii="Arial" w:hAnsi="Arial"/>
+          <w:rFonts w:eastAsia="Arial" w:cs="Arial"/>
           <w:b/>
           <w:bCs/>
           <w:color w:val="2563EB"/>
@@ -1950,7 +1527,7 @@
           <w:sz w:val="22"/>
           <w:szCs w:val="22"/>
         </w:rPr>
-        <w:t>The sentiment analysis on workout notes was also more informative than expected. The notes are written in an informal, stream-of-consciousness style, yet keyword scoring produced a stable signal over time. The finding that sentiment does not strongly correlate with RX rate (r = -0.16) was genuinely surprising and suggests that the athlete's motivation and perceived effort are decoupled from objective performance — a nuanced insight that neither raw data nor simple dashboards would surface.</w:t>
+        <w:t>The sentiment analysis on workout notes was also more informative than expected. The notes are written in an informal, stream-of-consciousness style, yet keyword scoring produced a stable signal over time. The finding that sentiment does not strongly correlate with RX rate (r = -0.16) was genuinely surprising and suggests that my motivation and perceived effort are decoupled from objective performance, this is a nuanced insight that neither raw data nor simple dashboards would surface.</w:t>
       </w:r>
     </w:p>
     <w:p>
@@ -1986,7 +1563,7 @@
       </w:pPr>
       <w:r>
         <w:rPr>
-          <w:rFonts w:eastAsia="Arial" w:cs="Arial" w:ascii="Arial" w:hAnsi="Arial"/>
+          <w:rFonts w:eastAsia="Arial" w:cs="Arial"/>
           <w:b/>
           <w:bCs/>
           <w:color w:val="2563EB"/>
@@ -2061,7 +1638,7 @@
       </w:pPr>
       <w:r>
         <w:rPr>
-          <w:rFonts w:eastAsia="Arial" w:cs="Arial" w:ascii="Arial" w:hAnsi="Arial"/>
+          <w:rFonts w:eastAsia="Arial" w:cs="Arial"/>
           <w:b/>
           <w:bCs/>
           <w:color w:val="2563EB"/>
@@ -2100,14 +1677,19 @@
           <w:sz w:val="22"/>
           <w:szCs w:val="22"/>
         </w:rPr>
-        <w:t>The PR forecasting model is deliberately simple — linear regression on a running maximum — which works well for early-stage athletes with monotonically increasing trends, but will become less accurate as the athlete plateaus and periodises. A future improvement would be to detect training blocks (periods of consistent weekly structure) and fit separate trend lines per block, producing more accurate short-term predictions.</w:t>
-      </w:r>
-    </w:p>
-    <w:p>
-      <w:pPr>
-        <w:pStyle w:val="Normal"/>
-        <w:spacing w:before="60" w:after="120"/>
-        <w:rPr/>
+        <w:t>The PR forecasting model is deliberately simple and may not be realistic — linear regression on a running maximum — which works well for early-stage athletes with monotonically increasing trends, but will become less accurate as I hit plateaus and periodises. A future improvement would be to detect training blocks (periods of consistent weekly structure) and fit separate trend lines per block, producing more accurate short-term predictions.</w:t>
+      </w:r>
+    </w:p>
+    <w:p>
+      <w:pPr>
+        <w:pStyle w:val="Normal"/>
+        <w:spacing w:before="60" w:after="120"/>
+        <w:rPr>
+          <w:rFonts w:eastAsia="Arial" w:cs="Arial"/>
+          <w:color w:val="374151"/>
+          <w:sz w:val="22"/>
+          <w:szCs w:val="22"/>
+        </w:rPr>
       </w:pPr>
       <w:r>
         <w:rPr>
@@ -2122,6 +1704,27 @@
     <w:p>
       <w:pPr>
         <w:pStyle w:val="Normal"/>
+        <w:spacing w:before="60" w:after="120"/>
+        <w:rPr>
+          <w:rFonts w:eastAsia="Arial" w:cs="Arial"/>
+          <w:color w:val="374151"/>
+          <w:sz w:val="22"/>
+          <w:szCs w:val="22"/>
+        </w:rPr>
+      </w:pPr>
+      <w:r>
+        <w:rPr>
+          <w:rFonts w:eastAsia="Arial" w:cs="Arial"/>
+          <w:color w:val="374151"/>
+          <w:sz w:val="22"/>
+          <w:szCs w:val="22"/>
+        </w:rPr>
+        <w:t>At last but not at least, this project is the first phase of a broader personal project: I intend to add data from the other sport I participate in and add health data from my watch so to make the analysis more robust and accurate for better training insights and PR prediction. That might explain why motivation and perceived effort does not predict performance quality.</w:t>
+      </w:r>
+    </w:p>
+    <w:p>
+      <w:pPr>
+        <w:pStyle w:val="Normal"/>
         <w:spacing w:before="120" w:after="0"/>
         <w:rPr/>
       </w:pPr>
@@ -2136,7 +1739,7 @@
       </w:pPr>
       <w:r>
         <w:rPr>
-          <w:rFonts w:eastAsia="Arial" w:cs="Arial" w:ascii="Arial" w:hAnsi="Arial"/>
+          <w:rFonts w:eastAsia="Arial" w:cs="Arial"/>
           <w:b/>
           <w:bCs/>
           <w:color w:val="2563EB"/>
@@ -2159,7 +1762,7 @@
           <w:sz w:val="22"/>
           <w:szCs w:val="22"/>
         </w:rPr>
-        <w:t>The most important lesson was that tool selection should follow the question, not the other way around. Early in the project, there was a temptation to apply more sophisticated ML techniques — neural networks, ensemble methods — to justify the complexity. Examining the data carefully made clear that with ~367 rows across 28 months, simple models (linear regression, KMeans with k=4) were not only sufficient but more appropriate: they are interpretable, less prone to overfitting, and their outputs can be explained to the athlete in plain language.</w:t>
+        <w:t>The most important lesson was that tool selection should follow the question, not the other way around. Early in the project, there was a temptation to apply more sophisticated ML techniques to justify the complexity. Examining the data carefully made clear that with ~367 rows across 28 months, simple models (linear regression, KMeans with k=4) were not only sufficient but more appropriate: they are interpretable, less prone to overfitting, and their outputs can be explained to me in plain language.</w:t>
       </w:r>
     </w:p>
     <w:p>
@@ -2191,7 +1794,7 @@
           <w:sz w:val="22"/>
           <w:szCs w:val="22"/>
         </w:rPr>
-        <w:t>Finally, working with genuinely personal data — data that records real training sessions, real fatigue, real PRs — made every design decision feel consequential in a way that working with a public benchmark dataset does not. The PR forecasting model predicts a real upcoming performance window. The anomaly detection flags sessions that actually felt off. This grounding in real use made the tradeoffs between simplicity and accuracy much clearer to reason about.</w:t>
+        <w:t>Finally, working with genuinely personal data (data that records real training sessions, real fatigue, real PRs) made every design decision feel consequential in a way that working with a public benchmark dataset does not. The PR forecasting model predicts a real upcoming performance window. The anomaly detection flags sessions that actually felt off. This grounding in real use made the tradeoffs between simplicity and accuracy much clearer to reason about.</w:t>
       </w:r>
     </w:p>
     <w:p>
@@ -2252,51 +1855,7 @@
                 <w:sz w:val="22"/>
                 <w:szCs w:val="22"/>
               </w:rPr>
-              <w:t xml:space="preserve">  github.com/</w:t>
-            </w:r>
-            <w:r>
-              <w:rPr>
-                <w:rFonts w:eastAsia="Arial" w:cs="Arial"/>
-                <w:b/>
-                <w:bCs/>
-                <w:color w:val="FFFFFF"/>
-                <w:sz w:val="22"/>
-                <w:szCs w:val="22"/>
-              </w:rPr>
-              <w:t>helensamara</w:t>
-            </w:r>
-            <w:r>
-              <w:rPr>
-                <w:rFonts w:eastAsia="Arial" w:cs="Arial"/>
-                <w:b/>
-                <w:bCs/>
-                <w:color w:val="FFFFFF"/>
-                <w:sz w:val="22"/>
-                <w:szCs w:val="22"/>
-              </w:rPr>
-              <w:t>/performance-</w:t>
-            </w:r>
-            <w:r>
-              <w:rPr>
-                <w:rFonts w:eastAsia="Arial" w:cs="Arial"/>
-                <w:b/>
-                <w:bCs/>
-                <w:color w:val="FFFFFF"/>
-                <w:sz w:val="22"/>
-                <w:szCs w:val="22"/>
-              </w:rPr>
-              <w:t>intelligence-</w:t>
-            </w:r>
-            <w:r>
-              <w:rPr>
-                <w:rFonts w:eastAsia="Arial" w:cs="Arial"/>
-                <w:b/>
-                <w:bCs/>
-                <w:color w:val="FFFFFF"/>
-                <w:sz w:val="22"/>
-                <w:szCs w:val="22"/>
-              </w:rPr>
-              <w:t>agent</w:t>
+              <w:t xml:space="preserve">  github.com/helensamara/performance-intelligence-agent</w:t>
             </w:r>
           </w:p>
           <w:p>
@@ -2363,6 +1922,7 @@
     <w:qFormat/>
     <w:pPr>
       <w:widowControl/>
+      <w:suppressAutoHyphens w:val="true"/>
       <w:bidi w:val="0"/>
       <w:spacing w:before="0" w:after="0"/>
       <w:jc w:val="start"/>
@@ -2469,6 +2029,13 @@
       <w:vertAlign w:val="superscript"/>
     </w:rPr>
   </w:style>
+  <w:style w:type="character" w:styleId="FootnoteCharactersuser">
+    <w:name w:val="Footnote Characters (user)"/>
+    <w:qFormat/>
+    <w:rPr>
+      <w:vertAlign w:val="superscript"/>
+    </w:rPr>
+  </w:style>
   <w:style w:type="character" w:styleId="FootnoteReference">
     <w:name w:val="footnote reference"/>
     <w:rPr>
@@ -2560,6 +2127,7 @@
     <w:qFormat/>
     <w:pPr>
       <w:widowControl/>
+      <w:suppressAutoHyphens w:val="true"/>
       <w:bidi w:val="0"/>
       <w:spacing w:before="0" w:after="0"/>
       <w:jc w:val="start"/>
@@ -2580,6 +2148,7 @@
     <w:qFormat/>
     <w:pPr>
       <w:widowControl/>
+      <w:suppressAutoHyphens w:val="true"/>
       <w:bidi w:val="0"/>
       <w:spacing w:before="0" w:after="0"/>
       <w:jc w:val="start"/>

</xml_diff>